<commit_message>
Add submission plan, form texts, txt and MF-format PDF manuscript
Co-Authored-By: Claude Opus 5.5 <noreply@anthropic.com>
Claude-Session: https://claude.ai/code/session_01KE7iYCV4pvgNPYmvrhtzkb
</commit_message>
<xml_diff>
--- a/novel/word/02_企画書・あらすじ.docx
+++ b/novel/word/02_企画書・あらすじ.docx
@@ -1421,7 +1421,25 @@
           <w:sz w:val="21"/>
           <w:szCs w:val="21"/>
         </w:rPr>
-        <w:t xml:space="preserve">第一候補：小学館ライトノベル大賞（ガガガ文庫）。マケインと千歳くんを出した「青春×痛み×ラブコメ」に強いレーベル。規定70〜150枚で、1次を通過すると評価シートがもらえる。</w:t>
+        <w:t xml:space="preserve">第一候補：GA文庫大賞（締切 2026/11/30、txtのみ）か、MF文庫Jライトノベル新人賞（締切 2026/12/31、txt・pdfのみ）の</w:t>
+      </w:r>
+      <w:r>
+        <w:rPr>
+          <w:rFonts w:ascii="Yu Gothic" w:eastAsia="游ゴシック" w:hAnsi="Yu Gothic"/>
+          <w:b/>
+          <w:bCs/>
+          <w:sz w:val="21"/>
+          <w:szCs w:val="21"/>
+        </w:rPr>
+        <w:t xml:space="preserve">どちらか一つ</w:t>
+      </w:r>
+      <w:r>
+        <w:rPr>
+          <w:rFonts w:ascii="Yu Gothic" w:eastAsia="游ゴシック" w:hAnsi="Yu Gothic"/>
+          <w:sz w:val="21"/>
+          <w:szCs w:val="21"/>
+        </w:rPr>
+        <w:t xml:space="preserve">。</w:t>
       </w:r>
     </w:p>
     <w:p>
@@ -1438,7 +1456,7 @@
           <w:sz w:val="21"/>
           <w:szCs w:val="21"/>
         </w:rPr>
-        <w:t xml:space="preserve">次点：MF文庫Jライトノベル新人賞（年4期）、GA文庫大賞、電撃小説大賞。電撃は『デルタとガンマの理学部ノート』と題材が近く見えるので注意。</w:t>
+        <w:t xml:space="preserve">落選したら：小学館ライトノベル大賞（ガガガ。第21回は 2026/9/30 で締切済み、次回の要項待ち）か、電撃小説大賞（締切 2027/4/10）。</w:t>
       </w:r>
     </w:p>
     <w:p>
@@ -1466,6 +1484,23 @@
           <w:szCs w:val="21"/>
         </w:rPr>
         <w:t xml:space="preserve">：同じ原稿を複数の賞に同時に応募しないこと。落選の結果が出てから次の賞へ回す。</w:t>
+      </w:r>
+    </w:p>
+    <w:p>
+      <w:pPr>
+        <w:pStyle w:val="ListParagraph"/>
+        <w:numPr>
+          <w:ilvl w:val="0"/>
+          <w:numId w:val="2"/>
+        </w:numPr>
+      </w:pPr>
+      <w:r>
+        <w:rPr>
+          <w:rFonts w:ascii="Yu Gothic" w:eastAsia="游ゴシック" w:hAnsi="Yu Gothic"/>
+          <w:sz w:val="21"/>
+          <w:szCs w:val="21"/>
+        </w:rPr>
+        <w:t xml:space="preserve">詳細は「00_応募計画と提出用テキスト.md」を参照。</w:t>
       </w:r>
     </w:p>
     <w:p>

</xml_diff>